<commit_message>
Replace TOC field with static contents page; add PDF versions
The docx-js TOC field renders empty in LibreOffice and requires a manual
field update in Word. Replace it with a pre-filled static table of
contents with dot leaders, and ship ready-to-view PDF exports of both
the proposal document and the presentation deck.

Co-Authored-By: Claude Fable 5 <noreply@anthropic.com>
Claude-Session: https://claude.ai/code/session_015uk3TKTdhCd7sJHXgfZUnu
</commit_message>
<xml_diff>
--- a/docs/enterprise-proposal/Enterprise_Rental_System_Proposal.docx
+++ b/docs/enterprise-proposal/Enterprise_Rental_System_Proposal.docx
@@ -525,25 +525,347 @@
         <w:t xml:space="preserve">Table of Contents</w:t>
       </w:r>
     </w:p>
-    <w:sdt>
-      <w:sdtPr>
-        <w:alias w:val="Table of Contents"/>
-      </w:sdtPr>
-      <w:sdtContent>
-        <w:p>
-          <w:r>
-            <w:fldChar w:fldCharType="begin" w:dirty="true"/>
-            <w:instrText xml:space="preserve">TOC \h \o "1-2"</w:instrText>
-            <w:fldChar w:fldCharType="separate"/>
-          </w:r>
-        </w:p>
-        <w:p>
-          <w:r>
-            <w:fldChar w:fldCharType="end"/>
-          </w:r>
-        </w:p>
-      </w:sdtContent>
-    </w:sdt>
+    <w:p>
+      <w:pPr>
+        <w:spacing w:after="200"/>
+      </w:pPr>
+    </w:p>
+    <w:p>
+      <w:pPr>
+        <w:tabs>
+          <w:tab w:val="right" w:pos="9638" w:leader="dot"/>
+        </w:tabs>
+        <w:spacing w:after="210"/>
+      </w:pPr>
+      <w:r>
+        <w:rPr>
+          <w:rFonts w:ascii="Calibri" w:cs="Calibri" w:eastAsia="Calibri" w:hAnsi="Calibri"/>
+          <w:b/>
+          <w:bCs/>
+          <w:color w:val="1F2733"/>
+          <w:sz w:val="23"/>
+          <w:szCs w:val="23"/>
+        </w:rPr>
+        <w:t xml:space="preserve">1. Executive Summary</w:t>
+      </w:r>
+      <w:r>
+        <w:rPr>
+          <w:rFonts w:ascii="Calibri" w:cs="Calibri" w:eastAsia="Calibri" w:hAnsi="Calibri"/>
+          <w:color w:val="5C6B7A"/>
+          <w:sz w:val="23"/>
+          <w:szCs w:val="23"/>
+        </w:rPr>
+        <w:t xml:space="preserve">	3</w:t>
+      </w:r>
+    </w:p>
+    <w:p>
+      <w:pPr>
+        <w:tabs>
+          <w:tab w:val="right" w:pos="9638" w:leader="dot"/>
+        </w:tabs>
+        <w:spacing w:after="210"/>
+      </w:pPr>
+      <w:r>
+        <w:rPr>
+          <w:rFonts w:ascii="Calibri" w:cs="Calibri" w:eastAsia="Calibri" w:hAnsi="Calibri"/>
+          <w:b/>
+          <w:bCs/>
+          <w:color w:val="1F2733"/>
+          <w:sz w:val="23"/>
+          <w:szCs w:val="23"/>
+        </w:rPr>
+        <w:t xml:space="preserve">2. Business Context &amp; Objectives</w:t>
+      </w:r>
+      <w:r>
+        <w:rPr>
+          <w:rFonts w:ascii="Calibri" w:cs="Calibri" w:eastAsia="Calibri" w:hAnsi="Calibri"/>
+          <w:color w:val="5C6B7A"/>
+          <w:sz w:val="23"/>
+          <w:szCs w:val="23"/>
+        </w:rPr>
+        <w:t xml:space="preserve">	4</w:t>
+      </w:r>
+    </w:p>
+    <w:p>
+      <w:pPr>
+        <w:tabs>
+          <w:tab w:val="right" w:pos="9638" w:leader="dot"/>
+        </w:tabs>
+        <w:spacing w:after="210"/>
+      </w:pPr>
+      <w:r>
+        <w:rPr>
+          <w:rFonts w:ascii="Calibri" w:cs="Calibri" w:eastAsia="Calibri" w:hAnsi="Calibri"/>
+          <w:b/>
+          <w:bCs/>
+          <w:color w:val="1F2733"/>
+          <w:sz w:val="23"/>
+          <w:szCs w:val="23"/>
+        </w:rPr>
+        <w:t xml:space="preserve">3. Solution Overview</w:t>
+      </w:r>
+      <w:r>
+        <w:rPr>
+          <w:rFonts w:ascii="Calibri" w:cs="Calibri" w:eastAsia="Calibri" w:hAnsi="Calibri"/>
+          <w:color w:val="5C6B7A"/>
+          <w:sz w:val="23"/>
+          <w:szCs w:val="23"/>
+        </w:rPr>
+        <w:t xml:space="preserve">	5</w:t>
+      </w:r>
+    </w:p>
+    <w:p>
+      <w:pPr>
+        <w:tabs>
+          <w:tab w:val="right" w:pos="9638" w:leader="dot"/>
+        </w:tabs>
+        <w:spacing w:after="210"/>
+      </w:pPr>
+      <w:r>
+        <w:rPr>
+          <w:rFonts w:ascii="Calibri" w:cs="Calibri" w:eastAsia="Calibri" w:hAnsi="Calibri"/>
+          <w:b/>
+          <w:bCs/>
+          <w:color w:val="1F2733"/>
+          <w:sz w:val="23"/>
+          <w:szCs w:val="23"/>
+        </w:rPr>
+        <w:t xml:space="preserve">4. Functional Scope</w:t>
+      </w:r>
+      <w:r>
+        <w:rPr>
+          <w:rFonts w:ascii="Calibri" w:cs="Calibri" w:eastAsia="Calibri" w:hAnsi="Calibri"/>
+          <w:color w:val="5C6B7A"/>
+          <w:sz w:val="23"/>
+          <w:szCs w:val="23"/>
+        </w:rPr>
+        <w:t xml:space="preserve">	6</w:t>
+      </w:r>
+    </w:p>
+    <w:p>
+      <w:pPr>
+        <w:tabs>
+          <w:tab w:val="right" w:pos="9638" w:leader="dot"/>
+        </w:tabs>
+        <w:spacing w:after="210"/>
+      </w:pPr>
+      <w:r>
+        <w:rPr>
+          <w:rFonts w:ascii="Calibri" w:cs="Calibri" w:eastAsia="Calibri" w:hAnsi="Calibri"/>
+          <w:b/>
+          <w:bCs/>
+          <w:color w:val="1F2733"/>
+          <w:sz w:val="23"/>
+          <w:szCs w:val="23"/>
+        </w:rPr>
+        <w:t xml:space="preserve">5. Enterprise Architecture</w:t>
+      </w:r>
+      <w:r>
+        <w:rPr>
+          <w:rFonts w:ascii="Calibri" w:cs="Calibri" w:eastAsia="Calibri" w:hAnsi="Calibri"/>
+          <w:color w:val="5C6B7A"/>
+          <w:sz w:val="23"/>
+          <w:szCs w:val="23"/>
+        </w:rPr>
+        <w:t xml:space="preserve">	8</w:t>
+      </w:r>
+    </w:p>
+    <w:p>
+      <w:pPr>
+        <w:tabs>
+          <w:tab w:val="right" w:pos="9638" w:leader="dot"/>
+        </w:tabs>
+        <w:spacing w:after="210"/>
+      </w:pPr>
+      <w:r>
+        <w:rPr>
+          <w:rFonts w:ascii="Calibri" w:cs="Calibri" w:eastAsia="Calibri" w:hAnsi="Calibri"/>
+          <w:b/>
+          <w:bCs/>
+          <w:color w:val="1F2733"/>
+          <w:sz w:val="23"/>
+          <w:szCs w:val="23"/>
+        </w:rPr>
+        <w:t xml:space="preserve">6. Security &amp; Compliance</w:t>
+      </w:r>
+      <w:r>
+        <w:rPr>
+          <w:rFonts w:ascii="Calibri" w:cs="Calibri" w:eastAsia="Calibri" w:hAnsi="Calibri"/>
+          <w:color w:val="5C6B7A"/>
+          <w:sz w:val="23"/>
+          <w:szCs w:val="23"/>
+        </w:rPr>
+        <w:t xml:space="preserve">	10</w:t>
+      </w:r>
+    </w:p>
+    <w:p>
+      <w:pPr>
+        <w:tabs>
+          <w:tab w:val="right" w:pos="9638" w:leader="dot"/>
+        </w:tabs>
+        <w:spacing w:after="210"/>
+      </w:pPr>
+      <w:r>
+        <w:rPr>
+          <w:rFonts w:ascii="Calibri" w:cs="Calibri" w:eastAsia="Calibri" w:hAnsi="Calibri"/>
+          <w:b/>
+          <w:bCs/>
+          <w:color w:val="1F2733"/>
+          <w:sz w:val="23"/>
+          <w:szCs w:val="23"/>
+        </w:rPr>
+        <w:t xml:space="preserve">7. Implementation Roadmap</w:t>
+      </w:r>
+      <w:r>
+        <w:rPr>
+          <w:rFonts w:ascii="Calibri" w:cs="Calibri" w:eastAsia="Calibri" w:hAnsi="Calibri"/>
+          <w:color w:val="5C6B7A"/>
+          <w:sz w:val="23"/>
+          <w:szCs w:val="23"/>
+        </w:rPr>
+        <w:t xml:space="preserve">	11</w:t>
+      </w:r>
+    </w:p>
+    <w:p>
+      <w:pPr>
+        <w:tabs>
+          <w:tab w:val="right" w:pos="9638" w:leader="dot"/>
+        </w:tabs>
+        <w:spacing w:after="210"/>
+      </w:pPr>
+      <w:r>
+        <w:rPr>
+          <w:rFonts w:ascii="Calibri" w:cs="Calibri" w:eastAsia="Calibri" w:hAnsi="Calibri"/>
+          <w:b/>
+          <w:bCs/>
+          <w:color w:val="1F2733"/>
+          <w:sz w:val="23"/>
+          <w:szCs w:val="23"/>
+        </w:rPr>
+        <w:t xml:space="preserve">8. Risk Management</w:t>
+      </w:r>
+      <w:r>
+        <w:rPr>
+          <w:rFonts w:ascii="Calibri" w:cs="Calibri" w:eastAsia="Calibri" w:hAnsi="Calibri"/>
+          <w:color w:val="5C6B7A"/>
+          <w:sz w:val="23"/>
+          <w:szCs w:val="23"/>
+        </w:rPr>
+        <w:t xml:space="preserve">	12</w:t>
+      </w:r>
+    </w:p>
+    <w:p>
+      <w:pPr>
+        <w:tabs>
+          <w:tab w:val="right" w:pos="9638" w:leader="dot"/>
+        </w:tabs>
+        <w:spacing w:after="210"/>
+      </w:pPr>
+      <w:r>
+        <w:rPr>
+          <w:rFonts w:ascii="Calibri" w:cs="Calibri" w:eastAsia="Calibri" w:hAnsi="Calibri"/>
+          <w:b/>
+          <w:bCs/>
+          <w:color w:val="1F2733"/>
+          <w:sz w:val="23"/>
+          <w:szCs w:val="23"/>
+        </w:rPr>
+        <w:t xml:space="preserve">9. Success Metrics &amp; KPIs</w:t>
+      </w:r>
+      <w:r>
+        <w:rPr>
+          <w:rFonts w:ascii="Calibri" w:cs="Calibri" w:eastAsia="Calibri" w:hAnsi="Calibri"/>
+          <w:color w:val="5C6B7A"/>
+          <w:sz w:val="23"/>
+          <w:szCs w:val="23"/>
+        </w:rPr>
+        <w:t xml:space="preserve">	13</w:t>
+      </w:r>
+    </w:p>
+    <w:p>
+      <w:pPr>
+        <w:tabs>
+          <w:tab w:val="right" w:pos="9638" w:leader="dot"/>
+        </w:tabs>
+        <w:spacing w:after="210"/>
+      </w:pPr>
+      <w:r>
+        <w:rPr>
+          <w:rFonts w:ascii="Calibri" w:cs="Calibri" w:eastAsia="Calibri" w:hAnsi="Calibri"/>
+          <w:b/>
+          <w:bCs/>
+          <w:color w:val="1F2733"/>
+          <w:sz w:val="23"/>
+          <w:szCs w:val="23"/>
+        </w:rPr>
+        <w:t xml:space="preserve">10. Investment Summary</w:t>
+      </w:r>
+      <w:r>
+        <w:rPr>
+          <w:rFonts w:ascii="Calibri" w:cs="Calibri" w:eastAsia="Calibri" w:hAnsi="Calibri"/>
+          <w:color w:val="5C6B7A"/>
+          <w:sz w:val="23"/>
+          <w:szCs w:val="23"/>
+        </w:rPr>
+        <w:t xml:space="preserve">	13</w:t>
+      </w:r>
+    </w:p>
+    <w:p>
+      <w:pPr>
+        <w:tabs>
+          <w:tab w:val="right" w:pos="9638" w:leader="dot"/>
+        </w:tabs>
+        <w:spacing w:after="210"/>
+      </w:pPr>
+      <w:r>
+        <w:rPr>
+          <w:rFonts w:ascii="Calibri" w:cs="Calibri" w:eastAsia="Calibri" w:hAnsi="Calibri"/>
+          <w:b/>
+          <w:bCs/>
+          <w:color w:val="1F2733"/>
+          <w:sz w:val="23"/>
+          <w:szCs w:val="23"/>
+        </w:rPr>
+        <w:t xml:space="preserve">11. Service Levels &amp; Support Model</w:t>
+      </w:r>
+      <w:r>
+        <w:rPr>
+          <w:rFonts w:ascii="Calibri" w:cs="Calibri" w:eastAsia="Calibri" w:hAnsi="Calibri"/>
+          <w:color w:val="5C6B7A"/>
+          <w:sz w:val="23"/>
+          <w:szCs w:val="23"/>
+        </w:rPr>
+        <w:t xml:space="preserve">	14</w:t>
+      </w:r>
+    </w:p>
+    <w:p>
+      <w:pPr>
+        <w:tabs>
+          <w:tab w:val="right" w:pos="9638" w:leader="dot"/>
+        </w:tabs>
+        <w:spacing w:after="210"/>
+      </w:pPr>
+      <w:r>
+        <w:rPr>
+          <w:rFonts w:ascii="Calibri" w:cs="Calibri" w:eastAsia="Calibri" w:hAnsi="Calibri"/>
+          <w:b/>
+          <w:bCs/>
+          <w:color w:val="1F2733"/>
+          <w:sz w:val="23"/>
+          <w:szCs w:val="23"/>
+        </w:rPr>
+        <w:t xml:space="preserve">12. Conclusion &amp; Next Steps</w:t>
+      </w:r>
+      <w:r>
+        <w:rPr>
+          <w:rFonts w:ascii="Calibri" w:cs="Calibri" w:eastAsia="Calibri" w:hAnsi="Calibri"/>
+          <w:color w:val="5C6B7A"/>
+          <w:sz w:val="23"/>
+          <w:szCs w:val="23"/>
+        </w:rPr>
+        <w:t xml:space="preserve">	14</w:t>
+      </w:r>
+    </w:p>
     <w:p>
       <w:r>
         <w:br w:type="page"/>

</xml_diff>